<commit_message>
docs: update ethics form with user participation filled in
</commit_message>
<xml_diff>
--- a/EthicsForm.docx
+++ b/EthicsForm.docx
@@ -742,6 +742,15 @@
               </w:rPr>
               <w:fldChar w:fldCharType="end"/>
             </w:r>
+            <w:r>
+              <w:rPr>
+                <w:rFonts w:ascii="Arial" w:hAnsi="Arial" w:cs="Arial"/>
+                <w:i w:val="0"/>
+                <w:sz w:val="22"/>
+                <w:szCs w:val="22"/>
+              </w:rPr>
+              <w:t>X</w:t>
+            </w:r>
           </w:p>
         </w:tc>
         <w:tc>
@@ -837,15 +846,6 @@
                 <w:szCs w:val="22"/>
               </w:rPr>
               <w:fldChar w:fldCharType="end"/>
-            </w:r>
-            <w:r>
-              <w:rPr>
-                <w:rFonts w:ascii="Arial" w:hAnsi="Arial" w:cs="Arial"/>
-                <w:i w:val="0"/>
-                <w:sz w:val="22"/>
-                <w:szCs w:val="22"/>
-              </w:rPr>
-              <w:t>X</w:t>
             </w:r>
           </w:p>
         </w:tc>
@@ -1383,6 +1383,15 @@
               </w:rPr>
               <w:fldChar w:fldCharType="end"/>
             </w:r>
+            <w:r>
+              <w:rPr>
+                <w:rFonts w:ascii="Arial" w:hAnsi="Arial" w:cs="Arial"/>
+                <w:i w:val="0"/>
+                <w:sz w:val="22"/>
+                <w:szCs w:val="22"/>
+              </w:rPr>
+              <w:t>X</w:t>
+            </w:r>
           </w:p>
         </w:tc>
       </w:tr>
@@ -1578,6 +1587,15 @@
               </w:rPr>
               <w:fldChar w:fldCharType="end"/>
             </w:r>
+            <w:r>
+              <w:rPr>
+                <w:rFonts w:ascii="Arial" w:hAnsi="Arial" w:cs="Arial"/>
+                <w:i w:val="0"/>
+                <w:sz w:val="22"/>
+                <w:szCs w:val="22"/>
+              </w:rPr>
+              <w:t>X</w:t>
+            </w:r>
           </w:p>
         </w:tc>
       </w:tr>
@@ -1773,6 +1791,15 @@
               </w:rPr>
               <w:fldChar w:fldCharType="end"/>
             </w:r>
+            <w:r>
+              <w:rPr>
+                <w:rFonts w:ascii="Arial" w:hAnsi="Arial" w:cs="Arial"/>
+                <w:i w:val="0"/>
+                <w:sz w:val="22"/>
+                <w:szCs w:val="22"/>
+              </w:rPr>
+              <w:t>X</w:t>
+            </w:r>
           </w:p>
         </w:tc>
       </w:tr>
@@ -1953,6 +1980,15 @@
               </w:rPr>
               <w:fldChar w:fldCharType="end"/>
             </w:r>
+            <w:r>
+              <w:rPr>
+                <w:rFonts w:ascii="Arial" w:hAnsi="Arial" w:cs="Arial"/>
+                <w:i w:val="0"/>
+                <w:sz w:val="22"/>
+                <w:szCs w:val="22"/>
+              </w:rPr>
+              <w:t>X</w:t>
+            </w:r>
           </w:p>
         </w:tc>
       </w:tr>
@@ -2149,6 +2185,15 @@
               </w:rPr>
               <w:fldChar w:fldCharType="end"/>
             </w:r>
+            <w:r>
+              <w:rPr>
+                <w:rFonts w:ascii="Arial" w:hAnsi="Arial" w:cs="Arial"/>
+                <w:i w:val="0"/>
+                <w:sz w:val="22"/>
+                <w:szCs w:val="22"/>
+              </w:rPr>
+              <w:t>X</w:t>
+            </w:r>
           </w:p>
         </w:tc>
       </w:tr>
@@ -2333,6 +2378,15 @@
               </w:rPr>
               <w:fldChar w:fldCharType="end"/>
             </w:r>
+            <w:r>
+              <w:rPr>
+                <w:rFonts w:ascii="Arial" w:hAnsi="Arial" w:cs="Arial"/>
+                <w:i w:val="0"/>
+                <w:sz w:val="22"/>
+                <w:szCs w:val="22"/>
+              </w:rPr>
+              <w:t>X</w:t>
+            </w:r>
           </w:p>
         </w:tc>
       </w:tr>
@@ -2517,6 +2571,15 @@
               </w:rPr>
               <w:fldChar w:fldCharType="end"/>
             </w:r>
+            <w:r>
+              <w:rPr>
+                <w:rFonts w:ascii="Arial" w:hAnsi="Arial" w:cs="Arial"/>
+                <w:i w:val="0"/>
+                <w:sz w:val="22"/>
+                <w:szCs w:val="22"/>
+              </w:rPr>
+              <w:t>X</w:t>
+            </w:r>
           </w:p>
         </w:tc>
       </w:tr>
@@ -2701,6 +2764,15 @@
               </w:rPr>
               <w:fldChar w:fldCharType="end"/>
             </w:r>
+            <w:r>
+              <w:rPr>
+                <w:rFonts w:ascii="Arial" w:hAnsi="Arial" w:cs="Arial"/>
+                <w:i w:val="0"/>
+                <w:sz w:val="22"/>
+                <w:szCs w:val="22"/>
+              </w:rPr>
+              <w:t>X</w:t>
+            </w:r>
           </w:p>
         </w:tc>
       </w:tr>
@@ -2885,6 +2957,15 @@
               </w:rPr>
               <w:fldChar w:fldCharType="end"/>
             </w:r>
+            <w:r>
+              <w:rPr>
+                <w:rFonts w:ascii="Arial" w:hAnsi="Arial" w:cs="Arial"/>
+                <w:i w:val="0"/>
+                <w:sz w:val="22"/>
+                <w:szCs w:val="22"/>
+              </w:rPr>
+              <w:t>X</w:t>
+            </w:r>
           </w:p>
         </w:tc>
       </w:tr>
@@ -3068,6 +3149,15 @@
                 <w:szCs w:val="22"/>
               </w:rPr>
               <w:fldChar w:fldCharType="end"/>
+            </w:r>
+            <w:r>
+              <w:rPr>
+                <w:rFonts w:ascii="Arial" w:hAnsi="Arial" w:cs="Arial"/>
+                <w:i w:val="0"/>
+                <w:sz w:val="22"/>
+                <w:szCs w:val="22"/>
+              </w:rPr>
+              <w:t>X</w:t>
             </w:r>
           </w:p>
         </w:tc>
@@ -3268,6 +3358,15 @@
                 <w:szCs w:val="22"/>
               </w:rPr>
               <w:fldChar w:fldCharType="end"/>
+            </w:r>
+            <w:r>
+              <w:rPr>
+                <w:rFonts w:ascii="Arial" w:hAnsi="Arial" w:cs="Arial"/>
+                <w:i w:val="0"/>
+                <w:sz w:val="22"/>
+                <w:szCs w:val="22"/>
+              </w:rPr>
+              <w:t>X</w:t>
             </w:r>
           </w:p>
         </w:tc>

</xml_diff>